<commit_message>
S.O.I. Fase 0 v1.1 — Redefinición de roles: ZEUS=Líder Fábrica Software IA, ODIN=PMO IA. Eliminado Kimi Claw.
</commit_message>
<xml_diff>
--- a/SOI-INNOVADATCO-FASE0.docx
+++ b/SOI-INNOVADATCO-FASE0.docx
@@ -270,7 +270,7 @@
         <w:t xml:space="preserve"> </w:t>
       </w:r>
       <w:r>
-        <w:t xml:space="preserve">Google Workspace, Kimi Claw, NotebookLM, Gemini</w:t>
+        <w:t xml:space="preserve">Google Workspace, NotebookLM, Gemini</w:t>
       </w:r>
     </w:p>
     <w:bookmarkEnd w:id="21"/>
@@ -1282,48 +1282,22 @@
                 <w:bCs/>
                 <w:b/>
               </w:rPr>
-              <w:t xml:space="preserve">Kimi Claw Desktop</w:t>
-            </w:r>
-          </w:p>
-        </w:tc>
-        <w:tc>
-          <w:tcPr/>
-          <w:p>
-            <w:pPr>
-              <w:pStyle w:val="Compact"/>
-              <w:jc w:val="left"/>
-            </w:pPr>
-            <w:r>
-              <w:t xml:space="preserve">Mac Studio (local)</w:t>
-            </w:r>
-          </w:p>
-        </w:tc>
-        <w:tc>
-          <w:tcPr/>
-          <w:p>
-            <w:pPr>
-              <w:pStyle w:val="Compact"/>
-              <w:jc w:val="left"/>
-            </w:pPr>
-            <w:r>
-              <w:t xml:space="preserve">Operaciones locales, interfaz de desarrollo</w:t>
-            </w:r>
-          </w:p>
-        </w:tc>
-        <w:tc>
-          <w:tcPr/>
-          <w:p>
-            <w:pPr>
-              <w:pStyle w:val="Compact"/>
-              <w:jc w:val="left"/>
-            </w:pPr>
-            <w:r>
-              <w:t xml:space="preserve">Tareas locales, código, documentación</w:t>
-            </w:r>
-          </w:p>
-        </w:tc>
-      </w:tr>
-      <w:tr>
+              <w:t xml:space="preserve">ZEUS</w:t>
+            </w:r>
+          </w:p>
+        </w:tc>
+        <w:tc>
+          <w:tcPr/>
+          <w:p>
+            <w:pPr>
+              <w:pStyle w:val="Compact"/>
+              <w:jc w:val="left"/>
+            </w:pPr>
+            <w:r>
+              <w:t xml:space="preserve">OpenClaw Runtime (remoto)</w:t>
+            </w:r>
+          </w:p>
+        </w:tc>
         <w:tc>
           <w:tcPr/>
           <w:p>
@@ -1336,43 +1310,19 @@
                 <w:bCs/>
                 <w:b/>
               </w:rPr>
-              <w:t xml:space="preserve">ZEUS</w:t>
-            </w:r>
-          </w:p>
-        </w:tc>
-        <w:tc>
-          <w:tcPr/>
-          <w:p>
-            <w:pPr>
-              <w:pStyle w:val="Compact"/>
-              <w:jc w:val="left"/>
-            </w:pPr>
-            <w:r>
-              <w:t xml:space="preserve">OpenClaw Runtime (remoto)</w:t>
-            </w:r>
-          </w:p>
-        </w:tc>
-        <w:tc>
-          <w:tcPr/>
-          <w:p>
-            <w:pPr>
-              <w:pStyle w:val="Compact"/>
-              <w:jc w:val="left"/>
-            </w:pPr>
-            <w:r>
-              <w:t xml:space="preserve">Tareas remotas, generación documental, PMO</w:t>
-            </w:r>
-          </w:p>
-        </w:tc>
-        <w:tc>
-          <w:tcPr/>
-          <w:p>
-            <w:pPr>
-              <w:pStyle w:val="Compact"/>
-              <w:jc w:val="left"/>
-            </w:pPr>
-            <w:r>
-              <w:t xml:space="preserve">Gestión de proyectos, documentos, sincronización</w:t>
+              <w:t xml:space="preserve">Líder de la Fábrica de Software IA</w:t>
+            </w:r>
+          </w:p>
+        </w:tc>
+        <w:tc>
+          <w:tcPr/>
+          <w:p>
+            <w:pPr>
+              <w:pStyle w:val="Compact"/>
+              <w:jc w:val="left"/>
+            </w:pPr>
+            <w:r>
+              <w:t xml:space="preserve">Arquitectura de software, orquestación de desarrollo, gobierno de código, validación técnica, memoria institucional</w:t>
             </w:r>
           </w:p>
         </w:tc>
@@ -1414,19 +1364,23 @@
               <w:jc w:val="left"/>
             </w:pPr>
             <w:r>
-              <w:t xml:space="preserve">Memoria empresarial continua, backend, validación técnica</w:t>
-            </w:r>
-          </w:p>
-        </w:tc>
-        <w:tc>
-          <w:tcPr/>
-          <w:p>
-            <w:pPr>
-              <w:pStyle w:val="Compact"/>
-              <w:jc w:val="left"/>
-            </w:pPr>
-            <w:r>
-              <w:t xml:space="preserve">Desarrollo de software, pruebas, auditoría</w:t>
+              <w:rPr>
+                <w:bCs/>
+                <w:b/>
+              </w:rPr>
+              <w:t xml:space="preserve">PMO IA de la empresa</w:t>
+            </w:r>
+          </w:p>
+        </w:tc>
+        <w:tc>
+          <w:tcPr/>
+          <w:p>
+            <w:pPr>
+              <w:pStyle w:val="Compact"/>
+              <w:jc w:val="left"/>
+            </w:pPr>
+            <w:r>
+              <w:t xml:space="preserve">Gestión de proyectos, seguimiento de entregables, control de estados, documentación de avances, auditoría de procesos</w:t>
             </w:r>
           </w:p>
         </w:tc>
@@ -1880,7 +1834,7 @@
           <w:bCs/>
           <w:b/>
         </w:rPr>
-        <w:t xml:space="preserve">ODIN no declara</w:t>
+        <w:t xml:space="preserve">ZEUS no declara</w:t>
       </w:r>
       <w:r>
         <w:rPr>
@@ -1942,7 +1896,7 @@
           <w:bCs/>
           <w:b/>
         </w:rPr>
-        <w:t xml:space="preserve">ZEUS valida con Acta</w:t>
+        <w:t xml:space="preserve">ODIN valida con Acta</w:t>
       </w:r>
       <w:r>
         <w:t xml:space="preserve"> </w:t>
@@ -1970,7 +1924,7 @@
         <w:t xml:space="preserve"> </w:t>
       </w:r>
       <w:r>
-        <w:t xml:space="preserve">→ Sin INSTRUCCION-XXX.md firmada, ODIN no empieza módulo nuevo</w:t>
+        <w:t xml:space="preserve">→ Sin INSTRUCCION-XXX.md firmada, ZEUS no empieza módulo nuevo</w:t>
       </w:r>
     </w:p>
     <w:bookmarkEnd w:id="35"/>
@@ -1992,13 +1946,13 @@
           <w:bCs/>
           <w:b/>
         </w:rPr>
-        <w:t xml:space="preserve">ODIN NUNCA toca IDC_PROYECTOS.</w:t>
-      </w:r>
-      <w:r>
-        <w:t xml:space="preserve"> </w:t>
-      </w:r>
-      <w:r>
-        <w:t xml:space="preserve">No puede leer/escribir archivos de gestión. Solo ZEUS toca el repo de gestión. ODIN lee de Desarrollos/.</w:t>
+        <w:t xml:space="preserve">ZEUS NUNCA toca IDC_PROYECTOS.</w:t>
+      </w:r>
+      <w:r>
+        <w:t xml:space="preserve"> </w:t>
+      </w:r>
+      <w:r>
+        <w:t xml:space="preserve">No puede leer/escribir archivos de gestión. Solo ODIN toca el repo de gestión. ZEUS lee de Desarrollos/.</w:t>
       </w:r>
     </w:p>
     <w:p>
@@ -4805,7 +4759,7 @@
               <w:jc w:val="left"/>
             </w:pPr>
             <w:r>
-              <w:t xml:space="preserve">Kimi Claw / OpenClaw Runtime</w:t>
+              <w:t xml:space="preserve">OpenClaw Runtime</w:t>
             </w:r>
           </w:p>
         </w:tc>
@@ -6521,7 +6475,17 @@
               <w:jc w:val="left"/>
             </w:pPr>
             <w:r>
-              <w:t xml:space="preserve">PMO, documental, orquestación, memoria institucional</w:t>
+              <w:rPr>
+                <w:bCs/>
+                <w:b/>
+              </w:rPr>
+              <w:t xml:space="preserve">Líder de la Fábrica de Software IA</w:t>
+            </w:r>
+            <w:r>
+              <w:t xml:space="preserve"> </w:t>
+            </w:r>
+            <w:r>
+              <w:t xml:space="preserve">— arquitectura, desarrollo, gobierno de código, validación técnica</w:t>
             </w:r>
           </w:p>
         </w:tc>
@@ -6563,49 +6527,17 @@
               <w:jc w:val="left"/>
             </w:pPr>
             <w:r>
-              <w:t xml:space="preserve">Desarrollo de software, validación técnica</w:t>
-            </w:r>
-          </w:p>
-        </w:tc>
-      </w:tr>
-      <w:tr>
-        <w:tc>
-          <w:tcPr/>
-          <w:p>
-            <w:pPr>
-              <w:pStyle w:val="Compact"/>
-              <w:jc w:val="left"/>
-            </w:pPr>
-            <w:r>
-              <w:t xml:space="preserve">—</w:t>
-            </w:r>
-          </w:p>
-        </w:tc>
-        <w:tc>
-          <w:tcPr/>
-          <w:p>
-            <w:pPr>
-              <w:pStyle w:val="Compact"/>
-              <w:jc w:val="left"/>
-            </w:pPr>
-            <w:r>
               <w:rPr>
                 <w:bCs/>
                 <w:b/>
               </w:rPr>
-              <w:t xml:space="preserve">Kimi Claw (IA local)</w:t>
-            </w:r>
-          </w:p>
-        </w:tc>
-        <w:tc>
-          <w:tcPr/>
-          <w:p>
-            <w:pPr>
-              <w:pStyle w:val="Compact"/>
-              <w:jc w:val="left"/>
-            </w:pPr>
-            <w:r>
-              <w:t xml:space="preserve">Operaciones locales, desarrollo en Mac Studio</w:t>
+              <w:t xml:space="preserve">PMO IA de la empresa</w:t>
+            </w:r>
+            <w:r>
+              <w:t xml:space="preserve"> </w:t>
+            </w:r>
+            <w:r>
+              <w:t xml:space="preserve">— gestión de proyectos, seguimiento de entregables, auditoría de procesos, control de estados</w:t>
             </w:r>
           </w:p>
         </w:tc>
@@ -7541,7 +7473,7 @@
               <w:jc w:val="left"/>
             </w:pPr>
             <w:r>
-              <w:t xml:space="preserve">Kimi Claw / OpenClaw</w:t>
+              <w:t xml:space="preserve">OpenClaw Runtime</w:t>
             </w:r>
           </w:p>
         </w:tc>
@@ -7565,7 +7497,7 @@
               <w:jc w:val="left"/>
             </w:pPr>
             <w:r>
-              <w:t xml:space="preserve">Infraestructura IA local y remota</w:t>
+              <w:t xml:space="preserve">Infraestructura IA remota</w:t>
             </w:r>
           </w:p>
         </w:tc>

</xml_diff>